<commit_message>
Change all templates and placeholder values default font to Arial size 10
</commit_message>
<xml_diff>
--- a/templates/af_delivery_address.docx
+++ b/templates/af_delivery_address.docx
@@ -403,7 +403,7 @@
   <w:docDefaults>
     <w:rPrDefault>
       <w:rPr>
-        <w:rFonts w:ascii="Calibri" w:hAnsi="Calibri" w:eastAsia="Calibri" w:cs="Calibri"/>
+        <w:rFonts w:ascii="Arial" w:hAnsi="Arial" w:eastAsia="Arial" w:cs="Arial"/>
         <w:sz w:val="20"/>
         <w:szCs w:val="20"/>
         <w:lang w:val="en-US"/>
@@ -470,7 +470,7 @@
   <w:style w:type="character">
     <w:name w:val="fTitle"/>
     <w:rPr>
-      <w:rFonts w:ascii="Calibri" w:hAnsi="Calibri" w:eastAsia="Calibri" w:cs="Calibri"/>
+      <w:rFonts w:ascii="Arial" w:hAnsi="Arial" w:eastAsia="Arial" w:cs="Arial"/>
       <w:color w:val="0E3B8A"/>
       <w:sz w:val="32"/>
       <w:szCs w:val="32"/>
@@ -481,7 +481,7 @@
   <w:style w:type="character">
     <w:name w:val="fDocType"/>
     <w:rPr>
-      <w:rFonts w:ascii="Calibri" w:hAnsi="Calibri" w:eastAsia="Calibri" w:cs="Calibri"/>
+      <w:rFonts w:ascii="Arial" w:hAnsi="Arial" w:eastAsia="Arial" w:cs="Arial"/>
       <w:color w:val="1A56DB"/>
       <w:sz w:val="28"/>
       <w:szCs w:val="28"/>
@@ -492,7 +492,7 @@
   <w:style w:type="character">
     <w:name w:val="fCompany"/>
     <w:rPr>
-      <w:rFonts w:ascii="Calibri" w:hAnsi="Calibri" w:eastAsia="Calibri" w:cs="Calibri"/>
+      <w:rFonts w:ascii="Arial" w:hAnsi="Arial" w:eastAsia="Arial" w:cs="Arial"/>
       <w:color w:val="0E3B8A"/>
       <w:sz w:val="28"/>
       <w:szCs w:val="28"/>
@@ -503,7 +503,7 @@
   <w:style w:type="character">
     <w:name w:val="fLabel"/>
     <w:rPr>
-      <w:rFonts w:ascii="Calibri" w:hAnsi="Calibri" w:eastAsia="Calibri" w:cs="Calibri"/>
+      <w:rFonts w:ascii="Arial" w:hAnsi="Arial" w:eastAsia="Arial" w:cs="Arial"/>
       <w:sz w:val="20"/>
       <w:szCs w:val="20"/>
       <w:b w:val="1"/>
@@ -513,7 +513,7 @@
   <w:style w:type="character">
     <w:name w:val="fValue"/>
     <w:rPr>
-      <w:rFonts w:ascii="Calibri" w:hAnsi="Calibri" w:eastAsia="Calibri" w:cs="Calibri"/>
+      <w:rFonts w:ascii="Arial" w:hAnsi="Arial" w:eastAsia="Arial" w:cs="Arial"/>
       <w:sz w:val="20"/>
       <w:szCs w:val="20"/>
     </w:rPr>
@@ -521,19 +521,19 @@
   <w:style w:type="character">
     <w:name w:val="fSmall"/>
     <w:rPr>
-      <w:rFonts w:ascii="Calibri" w:hAnsi="Calibri" w:eastAsia="Calibri" w:cs="Calibri"/>
+      <w:rFonts w:ascii="Arial" w:hAnsi="Arial" w:eastAsia="Arial" w:cs="Arial"/>
       <w:color w:val="666666"/>
-      <w:sz w:val="16"/>
-      <w:szCs w:val="16"/>
+      <w:sz w:val="20"/>
+      <w:szCs w:val="20"/>
     </w:rPr>
   </w:style>
   <w:style w:type="character">
     <w:name w:val="fSmallBold"/>
     <w:rPr>
-      <w:rFonts w:ascii="Calibri" w:hAnsi="Calibri" w:eastAsia="Calibri" w:cs="Calibri"/>
+      <w:rFonts w:ascii="Arial" w:hAnsi="Arial" w:eastAsia="Arial" w:cs="Arial"/>
       <w:color w:val="666666"/>
-      <w:sz w:val="16"/>
-      <w:szCs w:val="16"/>
+      <w:sz w:val="20"/>
+      <w:szCs w:val="20"/>
       <w:b w:val="1"/>
       <w:bCs w:val="1"/>
     </w:rPr>
@@ -541,10 +541,10 @@
   <w:style w:type="character">
     <w:name w:val="fTableHeader"/>
     <w:rPr>
-      <w:rFonts w:ascii="Calibri" w:hAnsi="Calibri" w:eastAsia="Calibri" w:cs="Calibri"/>
+      <w:rFonts w:ascii="Arial" w:hAnsi="Arial" w:eastAsia="Arial" w:cs="Arial"/>
       <w:color w:val="FFFFFF"/>
-      <w:sz w:val="18"/>
-      <w:szCs w:val="18"/>
+      <w:sz w:val="20"/>
+      <w:szCs w:val="20"/>
       <w:b w:val="1"/>
       <w:bCs w:val="1"/>
     </w:rPr>
@@ -552,15 +552,15 @@
   <w:style w:type="character">
     <w:name w:val="fTableCell"/>
     <w:rPr>
-      <w:rFonts w:ascii="Calibri" w:hAnsi="Calibri" w:eastAsia="Calibri" w:cs="Calibri"/>
-      <w:sz w:val="18"/>
-      <w:szCs w:val="18"/>
+      <w:rFonts w:ascii="Arial" w:hAnsi="Arial" w:eastAsia="Arial" w:cs="Arial"/>
+      <w:sz w:val="20"/>
+      <w:szCs w:val="20"/>
     </w:rPr>
   </w:style>
   <w:style w:type="character">
     <w:name w:val="fTotalLabel"/>
     <w:rPr>
-      <w:rFonts w:ascii="Calibri" w:hAnsi="Calibri" w:eastAsia="Calibri" w:cs="Calibri"/>
+      <w:rFonts w:ascii="Arial" w:hAnsi="Arial" w:eastAsia="Arial" w:cs="Arial"/>
       <w:sz w:val="20"/>
       <w:szCs w:val="20"/>
       <w:b w:val="1"/>
@@ -570,10 +570,10 @@
   <w:style w:type="character">
     <w:name w:val="fTotalValue"/>
     <w:rPr>
-      <w:rFonts w:ascii="Calibri" w:hAnsi="Calibri" w:eastAsia="Calibri" w:cs="Calibri"/>
+      <w:rFonts w:ascii="Arial" w:hAnsi="Arial" w:eastAsia="Arial" w:cs="Arial"/>
       <w:color w:val="0E3B8A"/>
-      <w:sz w:val="22"/>
-      <w:szCs w:val="22"/>
+      <w:sz w:val="20"/>
+      <w:szCs w:val="20"/>
       <w:b w:val="1"/>
       <w:bCs w:val="1"/>
     </w:rPr>
@@ -581,9 +581,9 @@
   <w:style w:type="character">
     <w:name w:val="fAddressLabel"/>
     <w:rPr>
-      <w:rFonts w:ascii="Calibri" w:hAnsi="Calibri" w:eastAsia="Calibri" w:cs="Calibri"/>
-      <w:sz w:val="22"/>
-      <w:szCs w:val="22"/>
+      <w:rFonts w:ascii="Arial" w:hAnsi="Arial" w:eastAsia="Arial" w:cs="Arial"/>
+      <w:sz w:val="20"/>
+      <w:szCs w:val="20"/>
       <w:b w:val="1"/>
       <w:bCs w:val="1"/>
     </w:rPr>
@@ -591,9 +591,9 @@
   <w:style w:type="character">
     <w:name w:val="fAddressName"/>
     <w:rPr>
-      <w:rFonts w:ascii="Calibri" w:hAnsi="Calibri" w:eastAsia="Calibri" w:cs="Calibri"/>
-      <w:sz w:val="26"/>
-      <w:szCs w:val="26"/>
+      <w:rFonts w:ascii="Arial" w:hAnsi="Arial" w:eastAsia="Arial" w:cs="Arial"/>
+      <w:sz w:val="20"/>
+      <w:szCs w:val="20"/>
       <w:b w:val="1"/>
       <w:bCs w:val="1"/>
     </w:rPr>
@@ -601,9 +601,9 @@
   <w:style w:type="character">
     <w:name w:val="fAddressText"/>
     <w:rPr>
-      <w:rFonts w:ascii="Calibri" w:hAnsi="Calibri" w:eastAsia="Calibri" w:cs="Calibri"/>
-      <w:sz w:val="24"/>
-      <w:szCs w:val="24"/>
+      <w:rFonts w:ascii="Arial" w:hAnsi="Arial" w:eastAsia="Arial" w:cs="Arial"/>
+      <w:sz w:val="20"/>
+      <w:szCs w:val="20"/>
     </w:rPr>
   </w:style>
 </w:styles>

</xml_diff>